<commit_message>
Major Update: The application now prefers **Supabase** for shared cross-user visibility and uses IndexedDB as a fallback when remote access is unavailable
</commit_message>
<xml_diff>
--- a/OmniPay_System_Documentation.docx
+++ b/OmniPay_System_Documentation.docx
@@ -51,7 +51,7 @@
         <w:br/>
       </w:r>
       <w:r>
-        <w:t>Released: June 12, 2026</w:t>
+        <w:t>Released: June 18, 2026</w:t>
         <w:br/>
       </w:r>
       <w:r>
@@ -173,22 +173,24 @@
     <w:p>
       <w:r>
         <w:br/>
-        <w:t>The OmniPay POS Inventory System is a comprehensive, browser-based application designed to manage and track Point-of-Sale (POS) terminal inventory across multiple locations and vendors. The system enables efficient daily reconciliation of inventory against portal records, vendor management, and repair tracking.</w:t>
+        <w:t>The OmniPay POS Inventory System is a comprehensive inventory workflow for managing POS terminal records across multiple users, locations, and vendors. The platform now combines Supabase-backed shared storage with browser fallback support so teams can import data, reconcile records, review dashboards, and track terminal history without losing visibility across sessions.</w:t>
         <w:br/>
         <w:br/>
         <w:t>Key Capabilities:</w:t>
         <w:br/>
-        <w:t>• Master inventory management with detailed tracking of terminal status</w:t>
+        <w:t>• Shared inventory and portal data storage with Supabase-first reads and writes</w:t>
         <w:br/>
-        <w:t>• Daily automated reconciliation between inventory and portal data</w:t>
+        <w:t>• Role-based access for admins, approved users, and restricted users</w:t>
         <w:br/>
-        <w:t>• Vendor management with repair cost tracking</w:t>
+        <w:t>• Large import support for thousands of rows through paged/chunked processing</w:t>
         <w:br/>
-        <w:t>• Real-time search and filtering across all data</w:t>
+        <w:t>• Daily automated reconciliation between inventory and portal records</w:t>
         <w:br/>
-        <w:t>• Local persistence ensuring data availability offline</w:t>
+        <w:t>• Vendor management with repair cost tracking and fault-based uploads</w:t>
         <w:br/>
-        <w:t>• Export capabilities for reporting and analysis</w:t>
+        <w:t>• Real-time search, filtering, pagination, and export capabilities</w:t>
+        <w:br/>
+        <w:t>• Full audit trail through reconciliation and tracking logs</w:t>
         <w:br/>
       </w:r>
     </w:p>
@@ -327,22 +329,26 @@
         <w:br/>
         <w:t>↓</w:t>
         <w:br/>
-        <w:t>State Management &amp; Routing (React Router)</w:t>
+        <w:t>Routing, Auth, and Protected Views</w:t>
         <w:br/>
         <w:t>↓</w:t>
         <w:br/>
-        <w:t>Data Persistence (IndexedDB - Browser Local Storage)</w:t>
+        <w:t>Data Layer (Supabase-first with IndexedDB fallback)</w:t>
+        <w:br/>
+        <w:t>↓</w:t>
+        <w:br/>
+        <w:t>Excel Import, Reconciliation, and Audit Logging</w:t>
         <w:br/>
         <w:br/>
         <w:t>This architecture ensures:</w:t>
         <w:br/>
-        <w:t>• No reliance on external servers for data storage</w:t>
+        <w:t>• Shared access for authorized users across browsers and sessions</w:t>
         <w:br/>
-        <w:t>• Full data availability across browser sessions</w:t>
+        <w:t>• Reliable sync and fallback storage for operational continuity</w:t>
         <w:br/>
-        <w:t>• Fast performance with instant data retrieval</w:t>
+        <w:t>• Fast retrieval and filtering for large inventory datasets</w:t>
         <w:br/>
-        <w:t>• Foundation for future server-backed sync</w:t>
+        <w:t>• Support for admin controls, approvals, and audit history</w:t>
         <w:br/>
       </w:r>
     </w:p>
@@ -649,7 +655,39 @@
           </w:tcPr>
           <w:p>
             <w:r>
-              <w:t>Client-side page navigation</w:t>
+              <w:t>Protected page navigation and routing</w:t>
+            </w:r>
+          </w:p>
+        </w:tc>
+      </w:tr>
+      <w:tr>
+        <w:tc>
+          <w:tcPr>
+            <w:tcW w:type="dxa" w:w="2880"/>
+          </w:tcPr>
+          <w:p>
+            <w:r>
+              <w:t>Authentication</w:t>
+            </w:r>
+          </w:p>
+        </w:tc>
+        <w:tc>
+          <w:tcPr>
+            <w:tcW w:type="dxa" w:w="2880"/>
+          </w:tcPr>
+          <w:p>
+            <w:r>
+              <w:t>Supabase Auth</w:t>
+            </w:r>
+          </w:p>
+        </w:tc>
+        <w:tc>
+          <w:tcPr>
+            <w:tcW w:type="dxa" w:w="2880"/>
+          </w:tcPr>
+          <w:p>
+            <w:r>
+              <w:t>Login, registration, approvals, and access control</w:t>
             </w:r>
           </w:p>
         </w:tc>
@@ -671,7 +709,7 @@
           </w:tcPr>
           <w:p>
             <w:r>
-              <w:t>IndexedDB</w:t>
+              <w:t>Supabase + IndexedDB</w:t>
             </w:r>
           </w:p>
         </w:tc>
@@ -681,7 +719,39 @@
           </w:tcPr>
           <w:p>
             <w:r>
-              <w:t>Local browser-based storage</w:t>
+              <w:t>Shared storage with browser fallback support</w:t>
+            </w:r>
+          </w:p>
+        </w:tc>
+      </w:tr>
+      <w:tr>
+        <w:tc>
+          <w:tcPr>
+            <w:tcW w:type="dxa" w:w="2880"/>
+          </w:tcPr>
+          <w:p>
+            <w:r>
+              <w:t>Excel Processing</w:t>
+            </w:r>
+          </w:p>
+        </w:tc>
+        <w:tc>
+          <w:tcPr>
+            <w:tcW w:type="dxa" w:w="2880"/>
+          </w:tcPr>
+          <w:p>
+            <w:r>
+              <w:t>SheetJS / XLSX</w:t>
+            </w:r>
+          </w:p>
+        </w:tc>
+        <w:tc>
+          <w:tcPr>
+            <w:tcW w:type="dxa" w:w="2880"/>
+          </w:tcPr>
+          <w:p>
+            <w:r>
+              <w:t>Import, validation, export, and reconciliation workflows</w:t>
             </w:r>
           </w:p>
         </w:tc>
@@ -1141,7 +1211,7 @@
         <w:t xml:space="preserve">2. </w:t>
       </w:r>
       <w:r>
-        <w:t>Open OmniPay system (localhost:5174)</w:t>
+        <w:t>Open OmniPay system (localhost:5173)</w:t>
       </w:r>
     </w:p>
     <w:p>
@@ -1475,7 +1545,7 @@
         <w:pStyle w:val="Heading2"/>
       </w:pPr>
       <w:r>
-        <w:t>Issue 3: Data disappears after browser reload</w:t>
+        <w:t>Issue 3: Data does not appear for another user or browser</w:t>
       </w:r>
     </w:p>
     <w:p>
@@ -1486,7 +1556,7 @@
         <w:t xml:space="preserve">Cause: </w:t>
       </w:r>
       <w:r>
-        <w:t>Browser storage was cleared or cache issue</w:t>
+        <w:t>Supabase access or permissions are not configured correctly</w:t>
       </w:r>
     </w:p>
     <w:p>
@@ -1502,7 +1572,7 @@
         <w:pStyle w:val="ListNumber"/>
       </w:pPr>
       <w:r>
-        <w:t>Data is stored in browser IndexedDB - clearing cache may delete it</w:t>
+        <w:t>Verify that the Supabase URL and anon key are configured correctly in the environment</w:t>
       </w:r>
     </w:p>
     <w:p>
@@ -1510,7 +1580,7 @@
         <w:pStyle w:val="ListNumber"/>
       </w:pPr>
       <w:r>
-        <w:t>To prevent data loss, regularly export inventory to Excel backup</w:t>
+        <w:t>Confirm the user has the correct role and access to the relevant tables</w:t>
       </w:r>
     </w:p>
     <w:p>
@@ -1518,7 +1588,7 @@
         <w:pStyle w:val="ListNumber"/>
       </w:pPr>
       <w:r>
-        <w:t>Use Chrome DevTools &gt; Application &gt; IndexedDB to verify data presence</w:t>
+        <w:t>Check that the tables exist and that RLS policies allow the expected reads/writes</w:t>
       </w:r>
     </w:p>
     <w:p>
@@ -1526,7 +1596,7 @@
         <w:pStyle w:val="ListNumber"/>
       </w:pPr>
       <w:r>
-        <w:t>Do not clear browser cache if you want to retain data</w:t>
+        <w:t>If needed, export data and verify the fallback storage is not the only active source</w:t>
       </w:r>
     </w:p>
     <w:p>
@@ -2209,24 +2279,24 @@
     <w:p>
       <w:r>
         <w:br/>
-        <w:t>• Master Inventory: Persists in IndexedDB until cleared</w:t>
+        <w:t>• Master Inventory: Persists in the shared storage layer and fallback storage when needed</w:t>
         <w:br/>
-        <w:t>• Portal Records: Latest import stored, previous imports cleared</w:t>
+        <w:t>• Portal Records: Latest import stored and available across approved user sessions</w:t>
         <w:br/>
-        <w:t>• Reconciliation Logs: Last 500 logs kept, older ones auto-removed</w:t>
+        <w:t>• Reconciliation Logs: Audit history is maintained for review and reporting</w:t>
         <w:br/>
-        <w:t>• Vendor Data: Persists until manually deleted</w:t>
+        <w:t>• Vendor Data: Persists until manually updated or deleted</w:t>
         <w:br/>
-        <w:t>• Repair Records: Archived until user clears</w:t>
+        <w:t>• Repair Records: Available for historical and operational tracking</w:t>
         <w:br/>
         <w:br/>
         <w:t>Backup Strategy:</w:t>
         <w:br/>
-        <w:t>• Export inventory weekly to Excel backup files</w:t>
+        <w:t>• Export inventory and reconciliation results regularly to Excel</w:t>
         <w:br/>
-        <w:t>• Archive reconciliation logs monthly</w:t>
+        <w:t>• Archive logs and vendor history for audit purposes</w:t>
         <w:br/>
-        <w:t>• Date-stamp all exported files for audit trail</w:t>
+        <w:t>• Maintain copies of imported templates and source files used for reporting</w:t>
         <w:br/>
       </w:r>
     </w:p>
@@ -2270,7 +2340,7 @@
         <w:br/>
       </w:r>
       <w:r>
-        <w:t>A: After loading the page, the system works offline. Data syncs when connection is restored.</w:t>
+        <w:t>A: The application is best used with internet access for shared Supabase data, while the fallback layer helps when connectivity is limited.</w:t>
       </w:r>
     </w:p>
     <w:p>
@@ -2282,7 +2352,7 @@
         <w:br/>
       </w:r>
       <w:r>
-        <w:t>A: All data is stored locally in your browser's IndexedDB, not on a server.</w:t>
+        <w:t>A: Data is stored through Supabase when available and falls back to IndexedDB for local browser access when needed.</w:t>
       </w:r>
     </w:p>
     <w:p>
@@ -2294,7 +2364,7 @@
         <w:br/>
       </w:r>
       <w:r>
-        <w:t>A: Currently, the system is single-user per browser. A future version will support multi-user with server backend.</w:t>
+        <w:t>A: Yes, authorized users can work from shared records when the correct Supabase roles and policies are set up.</w:t>
       </w:r>
     </w:p>
     <w:p>
@@ -2306,7 +2376,7 @@
         <w:br/>
       </w:r>
       <w:r>
-        <w:t>A: Regularly export inventory and reconciliation logs to Excel using the Export buttons.</w:t>
+        <w:t>A: Regularly export inventory and reconciliation logs to Excel using the available Export actions.</w:t>
       </w:r>
     </w:p>
     <w:p>
@@ -2318,7 +2388,7 @@
         <w:br/>
       </w:r>
       <w:r>
-        <w:t>A: All data will be deleted. Always export backups first.</w:t>
+        <w:t>A: Browser-only copies may be lost, so it is important to confirm the shared storage source and export data regularly.</w:t>
       </w:r>
     </w:p>
     <w:p>
@@ -2330,7 +2400,7 @@
         <w:br/>
       </w:r>
       <w:r>
-        <w:t>A: Yes, format your data to match the template columns and import as Excel.</w:t>
+        <w:t>A: Yes, format your data to match the template columns and import it as Excel.</w:t>
       </w:r>
     </w:p>
     <w:p>
@@ -2357,7 +2427,7 @@
         <w:jc w:val="center"/>
       </w:pPr>
       <w:r>
-        <w:t>Document Generated: June 12, 2026 at 15:48:38</w:t>
+        <w:t>Document Generated: June 18, 2026 at 13:24:54</w:t>
         <w:br/>
       </w:r>
       <w:r>

</xml_diff>